<commit_message>
docs: replace playwright/browser-tools with chrome-devtools, regenerate .docx files
- Remove all references to deprecated playwright and browser-tools plugins
- Recommend chrome-devtools as default browser automation tool
- Add Claude in Chrome extension as advanced option (callout box)
- Update Part 6 (scraping) to use chrome-devtools install command
- Regenerate both .docx files from updated source so they match .md content
- Simplify README disclaimer about .md vs .docx (now fully synchronized)
</commit_message>
<xml_diff>
--- a/docs/02-claude-code-dla-projektantow-ux.docx
+++ b/docs/02-claude-code-dla-projektantow-ux.docx
@@ -9671,7 +9671,7 @@
                 <w:i w:val="false"/>
                 <w:iCs w:val="false"/>
               </w:rPr>
-              <w:t xml:space="preserve">playwright</w:t>
+              <w:t xml:space="preserve">chrome-devtools</w:t>
             </w:r>
           </w:p>
         </w:tc>
@@ -9700,7 +9700,7 @@
                 <w:i w:val="false"/>
                 <w:iCs w:val="false"/>
               </w:rPr>
-              <w:t xml:space="preserve">Automatyczne testy UI — Claude może sam testować klikając w aplikację</w:t>
+              <w:t xml:space="preserve">Automatyzacja przeglądarki, screenshots, performance traces, console errors. Używa Puppeteer + Chrome DevTools Protocol pod spodem — działa z headless Chrome, nic nie musisz instalować ręcznie.</w:t>
             </w:r>
           </w:p>
         </w:tc>
@@ -9731,7 +9731,7 @@
                 <w:i w:val="false"/>
                 <w:iCs w:val="false"/>
               </w:rPr>
-              <w:t xml:space="preserve">commit-commands</w:t>
+              <w:t xml:space="preserve">context7</w:t>
             </w:r>
           </w:p>
         </w:tc>
@@ -9760,45 +9760,7 @@
                 <w:i w:val="false"/>
                 <w:iCs w:val="false"/>
               </w:rPr>
-              <w:t xml:space="preserve">Konwencjonalne commit messages (</w:t>
-            </w:r>
-            <w:r>
-              <w:rPr>
-                <w:rFonts w:ascii="Consolas" w:cs="Consolas" w:eastAsia="Consolas" w:hAnsi="Consolas"/>
-                <w:color w:val="BE185D"/>
-                <w:sz w:val="20"/>
-                <w:szCs w:val="20"/>
-              </w:rPr>
-              <w:t xml:space="preserve">/commit</w:t>
-            </w:r>
-            <w:r>
-              <w:rPr>
-                <w:rFonts w:ascii="Arial" w:cs="Arial" w:eastAsia="Arial" w:hAnsi="Arial"/>
-                <w:b w:val="false"/>
-                <w:bCs w:val="false"/>
-                <w:i w:val="false"/>
-                <w:iCs w:val="false"/>
-              </w:rPr>
-              <w:t xml:space="preserve">, </w:t>
-            </w:r>
-            <w:r>
-              <w:rPr>
-                <w:rFonts w:ascii="Consolas" w:cs="Consolas" w:eastAsia="Consolas" w:hAnsi="Consolas"/>
-                <w:color w:val="BE185D"/>
-                <w:sz w:val="20"/>
-                <w:szCs w:val="20"/>
-              </w:rPr>
-              <w:t xml:space="preserve">/release</w:t>
-            </w:r>
-            <w:r>
-              <w:rPr>
-                <w:rFonts w:ascii="Arial" w:cs="Arial" w:eastAsia="Arial" w:hAnsi="Arial"/>
-                <w:b w:val="false"/>
-                <w:bCs w:val="false"/>
-                <w:i w:val="false"/>
-                <w:iCs w:val="false"/>
-              </w:rPr>
-              <w:t xml:space="preserve">)</w:t>
+              <w:t xml:space="preserve">Aktualne dokumentacje bibliotek (Next.js, React, Tailwind, Supabase) — wstrzykiwane do kontekstu Claude'a, eliminuje halucynacje API.</w:t>
             </w:r>
           </w:p>
         </w:tc>
@@ -9829,7 +9791,7 @@
                 <w:i w:val="false"/>
                 <w:iCs w:val="false"/>
               </w:rPr>
-              <w:t xml:space="preserve">code-review</w:t>
+              <w:t xml:space="preserve">commit-commands</w:t>
             </w:r>
           </w:p>
         </w:tc>
@@ -9858,7 +9820,45 @@
                 <w:i w:val="false"/>
                 <w:iCs w:val="false"/>
               </w:rPr>
-              <w:t xml:space="preserve">Automatyczne review przed PR-em</w:t>
+              <w:t xml:space="preserve">Konwencjonalne commit messages (</w:t>
+            </w:r>
+            <w:r>
+              <w:rPr>
+                <w:rFonts w:ascii="Consolas" w:cs="Consolas" w:eastAsia="Consolas" w:hAnsi="Consolas"/>
+                <w:color w:val="BE185D"/>
+                <w:sz w:val="20"/>
+                <w:szCs w:val="20"/>
+              </w:rPr>
+              <w:t xml:space="preserve">/commit</w:t>
+            </w:r>
+            <w:r>
+              <w:rPr>
+                <w:rFonts w:ascii="Arial" w:cs="Arial" w:eastAsia="Arial" w:hAnsi="Arial"/>
+                <w:b w:val="false"/>
+                <w:bCs w:val="false"/>
+                <w:i w:val="false"/>
+                <w:iCs w:val="false"/>
+              </w:rPr>
+              <w:t xml:space="preserve">, </w:t>
+            </w:r>
+            <w:r>
+              <w:rPr>
+                <w:rFonts w:ascii="Consolas" w:cs="Consolas" w:eastAsia="Consolas" w:hAnsi="Consolas"/>
+                <w:color w:val="BE185D"/>
+                <w:sz w:val="20"/>
+                <w:szCs w:val="20"/>
+              </w:rPr>
+              <w:t xml:space="preserve">/release</w:t>
+            </w:r>
+            <w:r>
+              <w:rPr>
+                <w:rFonts w:ascii="Arial" w:cs="Arial" w:eastAsia="Arial" w:hAnsi="Arial"/>
+                <w:b w:val="false"/>
+                <w:bCs w:val="false"/>
+                <w:i w:val="false"/>
+                <w:iCs w:val="false"/>
+              </w:rPr>
+              <w:t xml:space="preserve">)</w:t>
             </w:r>
           </w:p>
         </w:tc>
@@ -9889,7 +9889,7 @@
                 <w:i w:val="false"/>
                 <w:iCs w:val="false"/>
               </w:rPr>
-              <w:t xml:space="preserve">feature-dev</w:t>
+              <w:t xml:space="preserve">code-review</w:t>
             </w:r>
           </w:p>
         </w:tc>
@@ -9918,7 +9918,7 @@
                 <w:i w:val="false"/>
                 <w:iCs w:val="false"/>
               </w:rPr>
-              <w:t xml:space="preserve">Strukturyzowany workflow rozwoju feature'a (wymagania → impl → testy)</w:t>
+              <w:t xml:space="preserve">Automatyczne review przed PR-em</w:t>
             </w:r>
           </w:p>
         </w:tc>
@@ -9949,7 +9949,7 @@
                 <w:i w:val="false"/>
                 <w:iCs w:val="false"/>
               </w:rPr>
-              <w:t xml:space="preserve">security-guidance</w:t>
+              <w:t xml:space="preserve">feature-dev</w:t>
             </w:r>
           </w:p>
         </w:tc>
@@ -9978,6 +9978,66 @@
                 <w:i w:val="false"/>
                 <w:iCs w:val="false"/>
               </w:rPr>
+              <w:t xml:space="preserve">Strukturyzowany workflow rozwoju feature'a (wymagania → impl → testy)</w:t>
+            </w:r>
+          </w:p>
+        </w:tc>
+      </w:tr>
+      <w:tr>
+        <w:tc>
+          <w:tcPr>
+            <w:tcW w:type="dxa" w:w="2400"/>
+            <w:tcBorders>
+              <w:top w:val="single" w:color="CBD5E1" w:sz="4"/>
+              <w:left w:val="single" w:color="CBD5E1" w:sz="4"/>
+              <w:bottom w:val="single" w:color="CBD5E1" w:sz="4"/>
+              <w:right w:val="single" w:color="CBD5E1" w:sz="4"/>
+            </w:tcBorders>
+            <w:tcMar>
+              <w:top w:type="dxa" w:w="100"/>
+              <w:left w:type="dxa" w:w="140"/>
+              <w:bottom w:type="dxa" w:w="100"/>
+              <w:right w:type="dxa" w:w="140"/>
+            </w:tcMar>
+          </w:tcPr>
+          <w:p>
+            <w:r>
+              <w:rPr>
+                <w:rFonts w:ascii="Arial" w:cs="Arial" w:eastAsia="Arial" w:hAnsi="Arial"/>
+                <w:b/>
+                <w:bCs/>
+                <w:i w:val="false"/>
+                <w:iCs w:val="false"/>
+              </w:rPr>
+              <w:t xml:space="preserve">security-guidance</w:t>
+            </w:r>
+          </w:p>
+        </w:tc>
+        <w:tc>
+          <w:tcPr>
+            <w:tcW w:type="dxa" w:w="6960"/>
+            <w:tcBorders>
+              <w:top w:val="single" w:color="CBD5E1" w:sz="4"/>
+              <w:left w:val="single" w:color="CBD5E1" w:sz="4"/>
+              <w:bottom w:val="single" w:color="CBD5E1" w:sz="4"/>
+              <w:right w:val="single" w:color="CBD5E1" w:sz="4"/>
+            </w:tcBorders>
+            <w:tcMar>
+              <w:top w:type="dxa" w:w="100"/>
+              <w:left w:type="dxa" w:w="140"/>
+              <w:bottom w:type="dxa" w:w="100"/>
+              <w:right w:type="dxa" w:w="140"/>
+            </w:tcMar>
+          </w:tcPr>
+          <w:p>
+            <w:r>
+              <w:rPr>
+                <w:rFonts w:ascii="Arial" w:cs="Arial" w:eastAsia="Arial" w:hAnsi="Arial"/>
+                <w:b w:val="false"/>
+                <w:bCs w:val="false"/>
+                <w:i w:val="false"/>
+                <w:iCs w:val="false"/>
+              </w:rPr>
               <w:t xml:space="preserve">Sprawdzanie bezpieczeństwa kodu (głównie pod kątem RLS Supabase, leaked secrets)</w:t>
             </w:r>
           </w:p>
@@ -10008,8 +10068,8 @@
         </w:tblBorders>
       </w:tblPr>
       <w:tblGrid>
-        <w:gridCol w:w="2900"/>
-        <w:gridCol w:w="6460"/>
+        <w:gridCol w:w="2400"/>
+        <w:gridCol w:w="6960"/>
       </w:tblGrid>
       <w:tr>
         <w:trPr>
@@ -10017,7 +10077,7 @@
         </w:trPr>
         <w:tc>
           <w:tcPr>
-            <w:tcW w:type="dxa" w:w="2900"/>
+            <w:tcW w:type="dxa" w:w="2400"/>
             <w:tcBorders>
               <w:top w:val="single" w:color="CBD5E1" w:sz="4"/>
               <w:left w:val="single" w:color="CBD5E1" w:sz="4"/>
@@ -10045,7 +10105,7 @@
         </w:tc>
         <w:tc>
           <w:tcPr>
-            <w:tcW w:type="dxa" w:w="6460"/>
+            <w:tcW w:type="dxa" w:w="6960"/>
             <w:tcBorders>
               <w:top w:val="single" w:color="CBD5E1" w:sz="4"/>
               <w:left w:val="single" w:color="CBD5E1" w:sz="4"/>
@@ -10075,7 +10135,7 @@
       <w:tr>
         <w:tc>
           <w:tcPr>
-            <w:tcW w:type="dxa" w:w="2900"/>
+            <w:tcW w:type="dxa" w:w="2400"/>
             <w:tcBorders>
               <w:top w:val="single" w:color="CBD5E1" w:sz="4"/>
               <w:left w:val="single" w:color="CBD5E1" w:sz="4"/>
@@ -10098,33 +10158,13 @@
                 <w:i w:val="false"/>
                 <w:iCs w:val="false"/>
               </w:rPr>
-              <w:t xml:space="preserve">firecrawl</w:t>
-            </w:r>
-            <w:r>
-              <w:rPr>
-                <w:rFonts w:ascii="Arial" w:cs="Arial" w:eastAsia="Arial" w:hAnsi="Arial"/>
-                <w:b w:val="false"/>
-                <w:bCs w:val="false"/>
-                <w:i w:val="false"/>
-                <w:iCs w:val="false"/>
-              </w:rPr>
-              <w:t xml:space="preserve"> lub </w:t>
-            </w:r>
-            <w:r>
-              <w:rPr>
-                <w:rFonts w:ascii="Arial" w:cs="Arial" w:eastAsia="Arial" w:hAnsi="Arial"/>
-                <w:b/>
-                <w:bCs/>
-                <w:i w:val="false"/>
-                <w:iCs w:val="false"/>
-              </w:rPr>
-              <w:t xml:space="preserve">playwright</w:t>
+              <w:t xml:space="preserve">chrome-devtools</w:t>
             </w:r>
           </w:p>
         </w:tc>
         <w:tc>
           <w:tcPr>
-            <w:tcW w:type="dxa" w:w="6460"/>
+            <w:tcW w:type="dxa" w:w="6960"/>
             <w:tcBorders>
               <w:top w:val="single" w:color="CBD5E1" w:sz="4"/>
               <w:left w:val="single" w:color="CBD5E1" w:sz="4"/>
@@ -10147,7 +10187,7 @@
                 <w:i w:val="false"/>
                 <w:iCs w:val="false"/>
               </w:rPr>
-              <w:t xml:space="preserve">Scraping istniejących stron (Część 6 instrukcji)</w:t>
+              <w:t xml:space="preserve">Najprostsza opcja: Claude otwiera headless Chrome, pobiera HTML/CSS/komponenty, robi screenshots. Idealne do scrapingu kursowego (Część 6 instrukcji).</w:t>
             </w:r>
           </w:p>
         </w:tc>
@@ -10155,7 +10195,7 @@
       <w:tr>
         <w:tc>
           <w:tcPr>
-            <w:tcW w:type="dxa" w:w="2900"/>
+            <w:tcW w:type="dxa" w:w="2400"/>
             <w:tcBorders>
               <w:top w:val="single" w:color="CBD5E1" w:sz="4"/>
               <w:left w:val="single" w:color="CBD5E1" w:sz="4"/>
@@ -10178,13 +10218,13 @@
                 <w:i w:val="false"/>
                 <w:iCs w:val="false"/>
               </w:rPr>
-              <w:t xml:space="preserve">browser-tools</w:t>
+              <w:t xml:space="preserve">firecrawl</w:t>
             </w:r>
           </w:p>
         </w:tc>
         <w:tc>
           <w:tcPr>
-            <w:tcW w:type="dxa" w:w="6460"/>
+            <w:tcW w:type="dxa" w:w="6960"/>
             <w:tcBorders>
               <w:top w:val="single" w:color="CBD5E1" w:sz="4"/>
               <w:left w:val="single" w:color="CBD5E1" w:sz="4"/>
@@ -10207,7 +10247,215 @@
                 <w:i w:val="false"/>
                 <w:iCs w:val="false"/>
               </w:rPr>
-              <w:t xml:space="preserve">Czytanie console errorów, screenshots z przeglądarki</w:t>
+              <w:t xml:space="preserve">Alternatywa dla scrapingu wielu stron z API (płatne po przekroczeniu free tier). Lepsze do mass scrapingu, słabsze do precyzyjnej rekonstrukcji UI.</w:t>
+            </w:r>
+          </w:p>
+        </w:tc>
+      </w:tr>
+    </w:tbl>
+    <w:tbl>
+      <w:tblPr>
+        <w:tblW w:type="dxa" w:w="9360"/>
+        <w:tblBorders>
+          <w:top w:val="none" w:color="FFFFFF" w:sz="0"/>
+          <w:left w:val="single" w:color="F59E0B" w:sz="24"/>
+          <w:bottom w:val="none" w:color="FFFFFF" w:sz="0"/>
+          <w:right w:val="none" w:color="FFFFFF" w:sz="0"/>
+          <w:insideH w:val="none" w:color="FFFFFF" w:sz="0"/>
+          <w:insideV w:val="none" w:color="FFFFFF" w:sz="0"/>
+        </w:tblBorders>
+      </w:tblPr>
+      <w:tblGrid>
+        <w:gridCol w:w="9360"/>
+      </w:tblGrid>
+      <w:tr>
+        <w:tc>
+          <w:tcPr>
+            <w:tcW w:type="dxa" w:w="9360"/>
+            <w:shd w:fill="FEF3C7" w:val="clear"/>
+            <w:tcMar>
+              <w:top w:type="dxa" w:w="120"/>
+              <w:left w:type="dxa" w:w="200"/>
+              <w:bottom w:type="dxa" w:w="120"/>
+              <w:right w:type="dxa" w:w="200"/>
+            </w:tcMar>
+          </w:tcPr>
+          <w:p>
+            <w:r>
+              <w:rPr>
+                <w:rFonts w:ascii="Arial" w:cs="Arial" w:eastAsia="Arial" w:hAnsi="Arial"/>
+                <w:b/>
+                <w:bCs/>
+                <w:i w:val="false"/>
+                <w:iCs w:val="false"/>
+              </w:rPr>
+              <w:t xml:space="preserve">Ekstra opcja dla zaawansowanych: </w:t>
+            </w:r>
+            <w:r>
+              <w:rPr>
+                <w:rFonts w:ascii="Consolas" w:cs="Consolas" w:eastAsia="Consolas" w:hAnsi="Consolas"/>
+                <w:color w:val="BE185D"/>
+                <w:sz w:val="20"/>
+                <w:szCs w:val="20"/>
+              </w:rPr>
+              <w:t xml:space="preserve">Claude in Chrome</w:t>
+            </w:r>
+            <w:r>
+              <w:rPr>
+                <w:rFonts w:ascii="Arial" w:cs="Arial" w:eastAsia="Arial" w:hAnsi="Arial"/>
+                <w:b/>
+                <w:bCs/>
+                <w:i w:val="false"/>
+                <w:iCs w:val="false"/>
+              </w:rPr>
+              <w:t xml:space="preserve"> extension.</w:t>
+            </w:r>
+            <w:r>
+              <w:rPr>
+                <w:rFonts w:ascii="Arial" w:cs="Arial" w:eastAsia="Arial" w:hAnsi="Arial"/>
+                <w:b w:val="false"/>
+                <w:bCs w:val="false"/>
+                <w:i w:val="false"/>
+                <w:iCs w:val="false"/>
+              </w:rPr>
+              <w:t xml:space="preserve"> To </w:t>
+            </w:r>
+            <w:r>
+              <w:rPr>
+                <w:rFonts w:ascii="Arial" w:cs="Arial" w:eastAsia="Arial" w:hAnsi="Arial"/>
+                <w:b/>
+                <w:bCs/>
+                <w:i w:val="false"/>
+                <w:iCs w:val="false"/>
+              </w:rPr>
+              <w:t xml:space="preserve">inne</w:t>
+            </w:r>
+            <w:r>
+              <w:rPr>
+                <w:rFonts w:ascii="Arial" w:cs="Arial" w:eastAsia="Arial" w:hAnsi="Arial"/>
+                <w:b w:val="false"/>
+                <w:bCs w:val="false"/>
+                <w:i w:val="false"/>
+                <w:iCs w:val="false"/>
+              </w:rPr>
+              <w:t xml:space="preserve"> narzędzie niż </w:t>
+            </w:r>
+            <w:r>
+              <w:rPr>
+                <w:rFonts w:ascii="Consolas" w:cs="Consolas" w:eastAsia="Consolas" w:hAnsi="Consolas"/>
+                <w:color w:val="BE185D"/>
+                <w:sz w:val="20"/>
+                <w:szCs w:val="20"/>
+              </w:rPr>
+              <w:t xml:space="preserve">chrome-devtools</w:t>
+            </w:r>
+            <w:r>
+              <w:rPr>
+                <w:rFonts w:ascii="Arial" w:cs="Arial" w:eastAsia="Arial" w:hAnsi="Arial"/>
+                <w:b w:val="false"/>
+                <w:bCs w:val="false"/>
+                <w:i w:val="false"/>
+                <w:iCs w:val="false"/>
+              </w:rPr>
+              <w:t xml:space="preserve"> plugin. Extension instaluje się w Twoim </w:t>
+            </w:r>
+            <w:r>
+              <w:rPr>
+                <w:rFonts w:ascii="Arial" w:cs="Arial" w:eastAsia="Arial" w:hAnsi="Arial"/>
+                <w:b/>
+                <w:bCs/>
+                <w:i w:val="false"/>
+                <w:iCs w:val="false"/>
+              </w:rPr>
+              <w:t xml:space="preserve">rzeczywistym Chrome</w:t>
+            </w:r>
+            <w:r>
+              <w:rPr>
+                <w:rFonts w:ascii="Arial" w:cs="Arial" w:eastAsia="Arial" w:hAnsi="Arial"/>
+                <w:b w:val="false"/>
+                <w:bCs w:val="false"/>
+                <w:i w:val="false"/>
+                <w:iCs w:val="false"/>
+              </w:rPr>
+              <w:t xml:space="preserve"> (Chrome Web Store, plan Pro+) i daje Claude'owi dostęp do </w:t>
+            </w:r>
+            <w:r>
+              <w:rPr>
+                <w:rFonts w:ascii="Arial" w:cs="Arial" w:eastAsia="Arial" w:hAnsi="Arial"/>
+                <w:b/>
+                <w:bCs/>
+                <w:i w:val="false"/>
+                <w:iCs w:val="false"/>
+              </w:rPr>
+              <w:t xml:space="preserve">Twoich zalogowanych sesji</w:t>
+            </w:r>
+            <w:r>
+              <w:rPr>
+                <w:rFonts w:ascii="Arial" w:cs="Arial" w:eastAsia="Arial" w:hAnsi="Arial"/>
+                <w:b w:val="false"/>
+                <w:bCs w:val="false"/>
+                <w:i w:val="false"/>
+                <w:iCs w:val="false"/>
+              </w:rPr>
+              <w:t xml:space="preserve"> — Gmail, Slack, Figma, Notion. Uruchamia się przez </w:t>
+            </w:r>
+            <w:r>
+              <w:rPr>
+                <w:rFonts w:ascii="Consolas" w:cs="Consolas" w:eastAsia="Consolas" w:hAnsi="Consolas"/>
+                <w:color w:val="BE185D"/>
+                <w:sz w:val="20"/>
+                <w:szCs w:val="20"/>
+              </w:rPr>
+              <w:t xml:space="preserve">claude --chrome</w:t>
+            </w:r>
+            <w:r>
+              <w:rPr>
+                <w:rFonts w:ascii="Arial" w:cs="Arial" w:eastAsia="Arial" w:hAnsi="Arial"/>
+                <w:b w:val="false"/>
+                <w:bCs w:val="false"/>
+                <w:i w:val="false"/>
+                <w:iCs w:val="false"/>
+              </w:rPr>
+              <w:t xml:space="preserve">. Idealne do testowania prototypu z prawdziwym kontem testowym albo do automatyzacji workflow'ów z Twoimi danymi. </w:t>
+            </w:r>
+            <w:r>
+              <w:rPr>
+                <w:rFonts w:ascii="Arial" w:cs="Arial" w:eastAsia="Arial" w:hAnsi="Arial"/>
+                <w:b/>
+                <w:bCs/>
+                <w:i w:val="false"/>
+                <w:iCs w:val="false"/>
+              </w:rPr>
+              <w:t xml:space="preserve">Trzymaj się jednak </w:t>
+            </w:r>
+            <w:r>
+              <w:rPr>
+                <w:rFonts w:ascii="Consolas" w:cs="Consolas" w:eastAsia="Consolas" w:hAnsi="Consolas"/>
+                <w:color w:val="BE185D"/>
+                <w:sz w:val="20"/>
+                <w:szCs w:val="20"/>
+              </w:rPr>
+              <w:t xml:space="preserve">chrome-devtools</w:t>
+            </w:r>
+            <w:r>
+              <w:rPr>
+                <w:rFonts w:ascii="Arial" w:cs="Arial" w:eastAsia="Arial" w:hAnsi="Arial"/>
+                <w:b/>
+                <w:bCs/>
+                <w:i w:val="false"/>
+                <w:iCs w:val="false"/>
+              </w:rPr>
+              <w:t xml:space="preserve"> plugin dla codziennej pracy</w:t>
+            </w:r>
+            <w:r>
+              <w:rPr>
+                <w:rFonts w:ascii="Arial" w:cs="Arial" w:eastAsia="Arial" w:hAnsi="Arial"/>
+                <w:b w:val="false"/>
+                <w:bCs w:val="false"/>
+                <w:i w:val="false"/>
+                <w:iCs w:val="false"/>
+              </w:rPr>
+              <w:t xml:space="preserve"> — jest prostszy, działa na headless Chrome, nie wymaga osobnej instalacji extension.</w:t>
             </w:r>
           </w:p>
         </w:tc>
@@ -13096,7 +13344,7 @@
           <w:sz w:val="20"/>
           <w:szCs w:val="20"/>
         </w:rPr>
-        <w:t xml:space="preserve">&gt; /plugin install playwright@claude-plugins-official</w:t>
+        <w:t xml:space="preserve">&gt; /plugin install chrome-devtools@claude-plugins-official</w:t>
       </w:r>
     </w:p>
     <w:p>
@@ -13105,13 +13353,57 @@
       </w:pPr>
       <w:r>
         <w:rPr>
-          <w:rFonts w:ascii="Arial" w:cs="Arial" w:eastAsia="Arial" w:hAnsi="Arial"/>
-          <w:b w:val="false"/>
-          <w:bCs w:val="false"/>
-          <w:i w:val="false"/>
-          <w:iCs w:val="false"/>
-        </w:rPr>
-        <w:t xml:space="preserve">Lub alternatywnie Firecrawl (jeśli wolisz prostsze API):</w:t>
+          <w:rFonts w:ascii="Consolas" w:cs="Consolas" w:eastAsia="Consolas" w:hAnsi="Consolas"/>
+          <w:color w:val="BE185D"/>
+          <w:sz w:val="20"/>
+          <w:szCs w:val="20"/>
+        </w:rPr>
+        <w:t xml:space="preserve">chrome-devtools</w:t>
+      </w:r>
+      <w:r>
+        <w:rPr>
+          <w:rFonts w:ascii="Arial" w:cs="Arial" w:eastAsia="Arial" w:hAnsi="Arial"/>
+          <w:b w:val="false"/>
+          <w:bCs w:val="false"/>
+          <w:i w:val="false"/>
+          <w:iCs w:val="false"/>
+        </w:rPr>
+        <w:t xml:space="preserve"> używa Puppeteer + Chrome DevTools Protocol pod spodem. Otwiera headless Chrome, pozwala Claude'owi nawigować po stronie, czytać HTML/CSS, robić screenshots, inspektować DOM. </w:t>
+      </w:r>
+      <w:r>
+        <w:rPr>
+          <w:rFonts w:ascii="Arial" w:cs="Arial" w:eastAsia="Arial" w:hAnsi="Arial"/>
+          <w:b/>
+          <w:bCs/>
+          <w:i w:val="false"/>
+          <w:iCs w:val="false"/>
+        </w:rPr>
+        <w:t xml:space="preserve">Niczego nie musisz instalować ręcznie</w:t>
+      </w:r>
+      <w:r>
+        <w:rPr>
+          <w:rFonts w:ascii="Arial" w:cs="Arial" w:eastAsia="Arial" w:hAnsi="Arial"/>
+          <w:b w:val="false"/>
+          <w:bCs w:val="false"/>
+          <w:i w:val="false"/>
+          <w:iCs w:val="false"/>
+        </w:rPr>
+        <w:t xml:space="preserve"> — plugin sam zarządza headless Chrome.</w:t>
+      </w:r>
+    </w:p>
+    <w:p>
+      <w:pPr>
+        <w:spacing w:after="120"/>
+      </w:pPr>
+      <w:r>
+        <w:rPr>
+          <w:rFonts w:ascii="Arial" w:cs="Arial" w:eastAsia="Arial" w:hAnsi="Arial"/>
+          <w:b w:val="false"/>
+          <w:bCs w:val="false"/>
+          <w:i w:val="false"/>
+          <w:iCs w:val="false"/>
+        </w:rPr>
+        <w:t xml:space="preserve">Lub alternatywnie Firecrawl (jeśli wolisz prostsze API i nie potrzebujesz pełnej kontroli nad przeglądarką):</w:t>
       </w:r>
     </w:p>
     <w:p>

</xml_diff>